<commit_message>
Recapture MS Project screenshots with full names and diagrams
</commit_message>
<xml_diff>
--- a/VIII.HUST/Quản trị dự án/BachMinhQuang_202490077/BaocaoTongHop_202490077_BachMinhQuang.docx
+++ b/VIII.HUST/Quản trị dự án/BachMinhQuang_202490077/BaocaoTongHop_202490077_BachMinhQuang.docx
@@ -645,7 +645,7 @@
       <w:r>
         <w:drawing>
           <wp:inline xmlns:a="http://schemas.openxmlformats.org/drawingml/2006/main" xmlns:pic="http://schemas.openxmlformats.org/drawingml/2006/picture">
-            <wp:extent cx="9828530" cy="5712134"/>
+            <wp:extent cx="9828530" cy="1614428"/>
             <wp:docPr id="1" name="Picture 1"/>
             <wp:cNvGraphicFramePr>
               <a:graphicFrameLocks noChangeAspect="1"/>
@@ -666,7 +666,7 @@
                   <pic:spPr>
                     <a:xfrm>
                       <a:off x="0" y="0"/>
-                      <a:ext cx="9828530" cy="5712134"/>
+                      <a:ext cx="9828530" cy="1614428"/>
                     </a:xfrm>
                     <a:prstGeom prst="rect"/>
                   </pic:spPr>
@@ -714,7 +714,7 @@
       <w:r>
         <w:drawing>
           <wp:inline xmlns:a="http://schemas.openxmlformats.org/drawingml/2006/main" xmlns:pic="http://schemas.openxmlformats.org/drawingml/2006/picture">
-            <wp:extent cx="9828530" cy="5712134"/>
+            <wp:extent cx="9828530" cy="3282586"/>
             <wp:docPr id="2" name="Picture 2"/>
             <wp:cNvGraphicFramePr>
               <a:graphicFrameLocks noChangeAspect="1"/>
@@ -735,7 +735,7 @@
                   <pic:spPr>
                     <a:xfrm>
                       <a:off x="0" y="0"/>
-                      <a:ext cx="9828530" cy="5712134"/>
+                      <a:ext cx="9828530" cy="3282586"/>
                     </a:xfrm>
                     <a:prstGeom prst="rect"/>
                   </pic:spPr>
@@ -783,7 +783,7 @@
       <w:r>
         <w:drawing>
           <wp:inline xmlns:a="http://schemas.openxmlformats.org/drawingml/2006/main" xmlns:pic="http://schemas.openxmlformats.org/drawingml/2006/picture">
-            <wp:extent cx="9828530" cy="5712134"/>
+            <wp:extent cx="9828530" cy="1614428"/>
             <wp:docPr id="3" name="Picture 3"/>
             <wp:cNvGraphicFramePr>
               <a:graphicFrameLocks noChangeAspect="1"/>
@@ -804,7 +804,7 @@
                   <pic:spPr>
                     <a:xfrm>
                       <a:off x="0" y="0"/>
-                      <a:ext cx="9828530" cy="5712134"/>
+                      <a:ext cx="9828530" cy="1614428"/>
                     </a:xfrm>
                     <a:prstGeom prst="rect"/>
                   </pic:spPr>
@@ -852,7 +852,7 @@
       <w:r>
         <w:drawing>
           <wp:inline xmlns:a="http://schemas.openxmlformats.org/drawingml/2006/main" xmlns:pic="http://schemas.openxmlformats.org/drawingml/2006/picture">
-            <wp:extent cx="9828530" cy="5712134"/>
+            <wp:extent cx="9828530" cy="3282586"/>
             <wp:docPr id="4" name="Picture 4"/>
             <wp:cNvGraphicFramePr>
               <a:graphicFrameLocks noChangeAspect="1"/>
@@ -873,7 +873,7 @@
                   <pic:spPr>
                     <a:xfrm>
                       <a:off x="0" y="0"/>
-                      <a:ext cx="9828530" cy="5712134"/>
+                      <a:ext cx="9828530" cy="3282586"/>
                     </a:xfrm>
                     <a:prstGeom prst="rect"/>
                   </pic:spPr>
@@ -966,7 +966,7 @@
       <w:r>
         <w:drawing>
           <wp:inline xmlns:a="http://schemas.openxmlformats.org/drawingml/2006/main" xmlns:pic="http://schemas.openxmlformats.org/drawingml/2006/picture">
-            <wp:extent cx="9828530" cy="5712134"/>
+            <wp:extent cx="9828530" cy="1871944"/>
             <wp:docPr id="5" name="Picture 5"/>
             <wp:cNvGraphicFramePr>
               <a:graphicFrameLocks noChangeAspect="1"/>
@@ -987,7 +987,7 @@
                   <pic:spPr>
                     <a:xfrm>
                       <a:off x="0" y="0"/>
-                      <a:ext cx="9828530" cy="5712134"/>
+                      <a:ext cx="9828530" cy="1871944"/>
                     </a:xfrm>
                     <a:prstGeom prst="rect"/>
                   </pic:spPr>
@@ -1035,7 +1035,7 @@
       <w:r>
         <w:drawing>
           <wp:inline xmlns:a="http://schemas.openxmlformats.org/drawingml/2006/main" xmlns:pic="http://schemas.openxmlformats.org/drawingml/2006/picture">
-            <wp:extent cx="9828530" cy="5712134"/>
+            <wp:extent cx="9828530" cy="3282586"/>
             <wp:docPr id="6" name="Picture 6"/>
             <wp:cNvGraphicFramePr>
               <a:graphicFrameLocks noChangeAspect="1"/>
@@ -1056,7 +1056,7 @@
                   <pic:spPr>
                     <a:xfrm>
                       <a:off x="0" y="0"/>
-                      <a:ext cx="9828530" cy="5712134"/>
+                      <a:ext cx="9828530" cy="3282586"/>
                     </a:xfrm>
                     <a:prstGeom prst="rect"/>
                   </pic:spPr>
@@ -1104,7 +1104,7 @@
       <w:r>
         <w:drawing>
           <wp:inline xmlns:a="http://schemas.openxmlformats.org/drawingml/2006/main" xmlns:pic="http://schemas.openxmlformats.org/drawingml/2006/picture">
-            <wp:extent cx="9828530" cy="5712134"/>
+            <wp:extent cx="9828530" cy="1871944"/>
             <wp:docPr id="7" name="Picture 7"/>
             <wp:cNvGraphicFramePr>
               <a:graphicFrameLocks noChangeAspect="1"/>
@@ -1125,7 +1125,7 @@
                   <pic:spPr>
                     <a:xfrm>
                       <a:off x="0" y="0"/>
-                      <a:ext cx="9828530" cy="5712134"/>
+                      <a:ext cx="9828530" cy="1871944"/>
                     </a:xfrm>
                     <a:prstGeom prst="rect"/>
                   </pic:spPr>
@@ -1173,7 +1173,7 @@
       <w:r>
         <w:drawing>
           <wp:inline xmlns:a="http://schemas.openxmlformats.org/drawingml/2006/main" xmlns:pic="http://schemas.openxmlformats.org/drawingml/2006/picture">
-            <wp:extent cx="9828530" cy="5712134"/>
+            <wp:extent cx="9828530" cy="3282586"/>
             <wp:docPr id="8" name="Picture 8"/>
             <wp:cNvGraphicFramePr>
               <a:graphicFrameLocks noChangeAspect="1"/>
@@ -1194,7 +1194,7 @@
                   <pic:spPr>
                     <a:xfrm>
                       <a:off x="0" y="0"/>
-                      <a:ext cx="9828530" cy="5712134"/>
+                      <a:ext cx="9828530" cy="3282586"/>
                     </a:xfrm>
                     <a:prstGeom prst="rect"/>
                   </pic:spPr>
@@ -1287,7 +1287,7 @@
       <w:r>
         <w:drawing>
           <wp:inline xmlns:a="http://schemas.openxmlformats.org/drawingml/2006/main" xmlns:pic="http://schemas.openxmlformats.org/drawingml/2006/picture">
-            <wp:extent cx="9828530" cy="5712134"/>
+            <wp:extent cx="9828530" cy="2258218"/>
             <wp:docPr id="9" name="Picture 9"/>
             <wp:cNvGraphicFramePr>
               <a:graphicFrameLocks noChangeAspect="1"/>
@@ -1308,7 +1308,7 @@
                   <pic:spPr>
                     <a:xfrm>
                       <a:off x="0" y="0"/>
-                      <a:ext cx="9828530" cy="5712134"/>
+                      <a:ext cx="9828530" cy="2258218"/>
                     </a:xfrm>
                     <a:prstGeom prst="rect"/>
                   </pic:spPr>
@@ -1356,7 +1356,7 @@
       <w:r>
         <w:drawing>
           <wp:inline xmlns:a="http://schemas.openxmlformats.org/drawingml/2006/main" xmlns:pic="http://schemas.openxmlformats.org/drawingml/2006/picture">
-            <wp:extent cx="9828530" cy="5712134"/>
+            <wp:extent cx="9828530" cy="3282586"/>
             <wp:docPr id="10" name="Picture 10"/>
             <wp:cNvGraphicFramePr>
               <a:graphicFrameLocks noChangeAspect="1"/>
@@ -1377,7 +1377,7 @@
                   <pic:spPr>
                     <a:xfrm>
                       <a:off x="0" y="0"/>
-                      <a:ext cx="9828530" cy="5712134"/>
+                      <a:ext cx="9828530" cy="3282586"/>
                     </a:xfrm>
                     <a:prstGeom prst="rect"/>
                   </pic:spPr>
@@ -1425,7 +1425,7 @@
       <w:r>
         <w:drawing>
           <wp:inline xmlns:a="http://schemas.openxmlformats.org/drawingml/2006/main" xmlns:pic="http://schemas.openxmlformats.org/drawingml/2006/picture">
-            <wp:extent cx="9828530" cy="5712134"/>
+            <wp:extent cx="9828530" cy="2258218"/>
             <wp:docPr id="11" name="Picture 11"/>
             <wp:cNvGraphicFramePr>
               <a:graphicFrameLocks noChangeAspect="1"/>
@@ -1446,7 +1446,7 @@
                   <pic:spPr>
                     <a:xfrm>
                       <a:off x="0" y="0"/>
-                      <a:ext cx="9828530" cy="5712134"/>
+                      <a:ext cx="9828530" cy="2258218"/>
                     </a:xfrm>
                     <a:prstGeom prst="rect"/>
                   </pic:spPr>
@@ -1494,7 +1494,7 @@
       <w:r>
         <w:drawing>
           <wp:inline xmlns:a="http://schemas.openxmlformats.org/drawingml/2006/main" xmlns:pic="http://schemas.openxmlformats.org/drawingml/2006/picture">
-            <wp:extent cx="9828530" cy="5712134"/>
+            <wp:extent cx="9828530" cy="3282586"/>
             <wp:docPr id="12" name="Picture 12"/>
             <wp:cNvGraphicFramePr>
               <a:graphicFrameLocks noChangeAspect="1"/>
@@ -1515,7 +1515,7 @@
                   <pic:spPr>
                     <a:xfrm>
                       <a:off x="0" y="0"/>
-                      <a:ext cx="9828530" cy="5712134"/>
+                      <a:ext cx="9828530" cy="3282586"/>
                     </a:xfrm>
                     <a:prstGeom prst="rect"/>
                   </pic:spPr>
@@ -1608,7 +1608,7 @@
       <w:r>
         <w:drawing>
           <wp:inline xmlns:a="http://schemas.openxmlformats.org/drawingml/2006/main" xmlns:pic="http://schemas.openxmlformats.org/drawingml/2006/picture">
-            <wp:extent cx="9828530" cy="5712134"/>
+            <wp:extent cx="9828530" cy="2129460"/>
             <wp:docPr id="13" name="Picture 13"/>
             <wp:cNvGraphicFramePr>
               <a:graphicFrameLocks noChangeAspect="1"/>
@@ -1629,7 +1629,7 @@
                   <pic:spPr>
                     <a:xfrm>
                       <a:off x="0" y="0"/>
-                      <a:ext cx="9828530" cy="5712134"/>
+                      <a:ext cx="9828530" cy="2129460"/>
                     </a:xfrm>
                     <a:prstGeom prst="rect"/>
                   </pic:spPr>
@@ -1677,7 +1677,7 @@
       <w:r>
         <w:drawing>
           <wp:inline xmlns:a="http://schemas.openxmlformats.org/drawingml/2006/main" xmlns:pic="http://schemas.openxmlformats.org/drawingml/2006/picture">
-            <wp:extent cx="9828530" cy="5712134"/>
+            <wp:extent cx="9828530" cy="3282586"/>
             <wp:docPr id="14" name="Picture 14"/>
             <wp:cNvGraphicFramePr>
               <a:graphicFrameLocks noChangeAspect="1"/>
@@ -1698,7 +1698,7 @@
                   <pic:spPr>
                     <a:xfrm>
                       <a:off x="0" y="0"/>
-                      <a:ext cx="9828530" cy="5712134"/>
+                      <a:ext cx="9828530" cy="3282586"/>
                     </a:xfrm>
                     <a:prstGeom prst="rect"/>
                   </pic:spPr>
@@ -1746,7 +1746,7 @@
       <w:r>
         <w:drawing>
           <wp:inline xmlns:a="http://schemas.openxmlformats.org/drawingml/2006/main" xmlns:pic="http://schemas.openxmlformats.org/drawingml/2006/picture">
-            <wp:extent cx="9828530" cy="5712134"/>
+            <wp:extent cx="9828530" cy="2129460"/>
             <wp:docPr id="15" name="Picture 15"/>
             <wp:cNvGraphicFramePr>
               <a:graphicFrameLocks noChangeAspect="1"/>
@@ -1767,7 +1767,7 @@
                   <pic:spPr>
                     <a:xfrm>
                       <a:off x="0" y="0"/>
-                      <a:ext cx="9828530" cy="5712134"/>
+                      <a:ext cx="9828530" cy="2129460"/>
                     </a:xfrm>
                     <a:prstGeom prst="rect"/>
                   </pic:spPr>
@@ -1815,7 +1815,7 @@
       <w:r>
         <w:drawing>
           <wp:inline xmlns:a="http://schemas.openxmlformats.org/drawingml/2006/main" xmlns:pic="http://schemas.openxmlformats.org/drawingml/2006/picture">
-            <wp:extent cx="9828530" cy="5712134"/>
+            <wp:extent cx="9828530" cy="3282586"/>
             <wp:docPr id="16" name="Picture 16"/>
             <wp:cNvGraphicFramePr>
               <a:graphicFrameLocks noChangeAspect="1"/>
@@ -1836,7 +1836,7 @@
                   <pic:spPr>
                     <a:xfrm>
                       <a:off x="0" y="0"/>
-                      <a:ext cx="9828530" cy="5712134"/>
+                      <a:ext cx="9828530" cy="3282586"/>
                     </a:xfrm>
                     <a:prstGeom prst="rect"/>
                   </pic:spPr>
@@ -1929,7 +1929,7 @@
       <w:r>
         <w:drawing>
           <wp:inline xmlns:a="http://schemas.openxmlformats.org/drawingml/2006/main" xmlns:pic="http://schemas.openxmlformats.org/drawingml/2006/picture">
-            <wp:extent cx="9828530" cy="5712134"/>
+            <wp:extent cx="9828530" cy="1871944"/>
             <wp:docPr id="17" name="Picture 17"/>
             <wp:cNvGraphicFramePr>
               <a:graphicFrameLocks noChangeAspect="1"/>
@@ -1950,7 +1950,7 @@
                   <pic:spPr>
                     <a:xfrm>
                       <a:off x="0" y="0"/>
-                      <a:ext cx="9828530" cy="5712134"/>
+                      <a:ext cx="9828530" cy="1871944"/>
                     </a:xfrm>
                     <a:prstGeom prst="rect"/>
                   </pic:spPr>
@@ -1998,7 +1998,7 @@
       <w:r>
         <w:drawing>
           <wp:inline xmlns:a="http://schemas.openxmlformats.org/drawingml/2006/main" xmlns:pic="http://schemas.openxmlformats.org/drawingml/2006/picture">
-            <wp:extent cx="9828530" cy="5712134"/>
+            <wp:extent cx="9828530" cy="3282586"/>
             <wp:docPr id="18" name="Picture 18"/>
             <wp:cNvGraphicFramePr>
               <a:graphicFrameLocks noChangeAspect="1"/>
@@ -2019,7 +2019,7 @@
                   <pic:spPr>
                     <a:xfrm>
                       <a:off x="0" y="0"/>
-                      <a:ext cx="9828530" cy="5712134"/>
+                      <a:ext cx="9828530" cy="3282586"/>
                     </a:xfrm>
                     <a:prstGeom prst="rect"/>
                   </pic:spPr>
@@ -2067,7 +2067,7 @@
       <w:r>
         <w:drawing>
           <wp:inline xmlns:a="http://schemas.openxmlformats.org/drawingml/2006/main" xmlns:pic="http://schemas.openxmlformats.org/drawingml/2006/picture">
-            <wp:extent cx="9828530" cy="5712134"/>
+            <wp:extent cx="9828530" cy="1871944"/>
             <wp:docPr id="19" name="Picture 19"/>
             <wp:cNvGraphicFramePr>
               <a:graphicFrameLocks noChangeAspect="1"/>
@@ -2088,7 +2088,7 @@
                   <pic:spPr>
                     <a:xfrm>
                       <a:off x="0" y="0"/>
-                      <a:ext cx="9828530" cy="5712134"/>
+                      <a:ext cx="9828530" cy="1871944"/>
                     </a:xfrm>
                     <a:prstGeom prst="rect"/>
                   </pic:spPr>
@@ -2136,7 +2136,7 @@
       <w:r>
         <w:drawing>
           <wp:inline xmlns:a="http://schemas.openxmlformats.org/drawingml/2006/main" xmlns:pic="http://schemas.openxmlformats.org/drawingml/2006/picture">
-            <wp:extent cx="9828530" cy="5712134"/>
+            <wp:extent cx="9828530" cy="3282586"/>
             <wp:docPr id="20" name="Picture 20"/>
             <wp:cNvGraphicFramePr>
               <a:graphicFrameLocks noChangeAspect="1"/>
@@ -2157,7 +2157,7 @@
                   <pic:spPr>
                     <a:xfrm>
                       <a:off x="0" y="0"/>
-                      <a:ext cx="9828530" cy="5712134"/>
+                      <a:ext cx="9828530" cy="3282586"/>
                     </a:xfrm>
                     <a:prstGeom prst="rect"/>
                   </pic:spPr>

</xml_diff>